<commit_message>
Commit At 2026-07-20 01:57:02
</commit_message>
<xml_diff>
--- a/周报.docx
+++ b/周报.docx
@@ -5,17 +5,9 @@
     <w:p>
       <w:pPr>
         <w:ind w:firstLine="420" w:firstLineChars="0"/>
-        <w:rPr>
-          <w:rFonts w:hint="eastAsia"/>
-          <w:lang w:val="en-US" w:eastAsia="zh-CN"/>
-        </w:rPr>
       </w:pPr>
       <w:r>
-        <w:rPr>
-          <w:rFonts w:hint="eastAsia"/>
-          <w:lang w:val="en-US" w:eastAsia="zh-CN"/>
-        </w:rPr>
-        <w:t>这一周概括而言，仍可以说是对优秀论文进行拼接，拿出模块来组成一个新的方案。但之前搞的方案，从整体上来看冰为有什么可以称得上更进一步的东西，无论是方案的创新性还是最终呈现出来的效率上，都不尽如人意。</w:t>
+        <w:t>针对此前跨域认证方案在整体创新性与最终效率上的瓶颈进行了根本性的思路调整。过往方案将动态 RSA 累加器（ACC）强绑定于恶意设备撤销阶段，在分布式异构网络中，这会导致海量终端为了同步 Witness 状态而频繁发起高开销的加密请求，极易引发地面控制站的单点计算瘫痪及 DoS/DDoS 攻击隐患。</w:t>
       </w:r>
     </w:p>
     <w:p>
@@ -28,10 +20,57 @@
       </w:pPr>
       <w:r>
         <w:rPr>
+          <w:lang w:val="en-US" w:eastAsia="zh-CN"/>
+        </w:rPr>
+        <w:t>仅就ACC本身而言，其在素数阶有限域上的基础迭代仅为低成本的模乘法（单步时间复杂度为</w:t>
+      </w:r>
+      <m:oMath>
+        <m:r>
+          <m:rPr>
+            <m:scr m:val="script"/>
+          </m:rPr>
+          <w:rPr>
+            <w:rFonts w:hint="default" w:ascii="Cambria Math" w:hAnsi="Cambria Math" w:eastAsia="MS Mincho"/>
+            <w:sz w:val="21"/>
+          </w:rPr>
+          <m:t>O</m:t>
+        </m:r>
+        <m:r>
+          <m:rPr/>
+          <w:rPr>
+            <w:rFonts w:hint="default" w:ascii="Cambria Math" w:hAnsi="Cambria Math"/>
+            <w:sz w:val="21"/>
+          </w:rPr>
+          <m:t>(1)</m:t>
+        </m:r>
+      </m:oMath>
+      <w:r>
+        <w:rPr>
+          <w:rFonts w:hint="default"/>
+          <w:lang w:val="en-US" w:eastAsia="zh-CN"/>
+        </w:rPr>
+        <w:t>）。之所以在传统撤销阶段表现糟糕，是因为试图执行全过程时，撤销某一设备需要计算第</w:t>
+      </w:r>
+      <w:r>
+        <w:rPr>
           <w:rFonts w:hint="eastAsia"/>
           <w:lang w:val="en-US" w:eastAsia="zh-CN"/>
         </w:rPr>
-        <w:t>这周的主要工作就是更换一下思路，把常用在其他阶段的一些思想转移到别的模块中，e.g., 撤销阶段常用的累加器，其在单纯添加的过程中其实是绝对可靠且高效的，只需要不断迭代出下一个素数即可，但在试图撤销某一个设备时，得直接计算一个第n个素数这种一般认为是NP的问题，这是累加器的安全保证，但也是累加器计算复杂度高的原因。我认为可以酱这个模块迁移到UAV假名生成的过程中去，不断有新的UAV加入进来，顺序迭代素数指标，即便之后某个UAV离开域甚至被撤销，我们不管，这只作为签名的一部分，也就是随机数的那一块，这样既保证了假名的唯一性，又避免了频繁的复杂计算。容易想到，这样在每个域内，的累加器值的映射会完全一致，因此，我们可以对不同的域内的累加器赋予一个随机的nounce，对每个特定的累加器而言，这个nounce是固定的，但这样一来就确保了各域间累加器的取值不一样。而且，我们并不是把累加器作为签名安全性的唯一保证，我们只是利用累加器理论上无限的容量进行一个可行、可追溯的伪随机数生成。</w:t>
+        <w:t>n</w:t>
+      </w:r>
+      <w:r>
+        <w:rPr>
+          <w:rFonts w:hint="default"/>
+          <w:lang w:val="en-US" w:eastAsia="zh-CN"/>
+        </w:rPr>
+        <w:t>个素数这一类NP难题</w:t>
+      </w:r>
+      <w:r>
+        <w:rPr>
+          <w:rFonts w:hint="eastAsia"/>
+          <w:lang w:val="en-US" w:eastAsia="zh-CN"/>
+        </w:rPr>
+        <w:t>，这是指数型的问题，而乘法型看似没有这类烦恼，但仍存在分布式系统共识的问题，即首先得知晓目标的被赋予了什么样的值，而且由于试图赋予各域间的一个随机性，在ACC内部会有一个独属于这个域本身的随机数，因此必须在保证隐私的情况下传递目标的信息，然后各域自己选择是否去更新，因为跨域认证会有实体的移动，在UAV数量趋于稳定时，可认为每一个新加入的实体对应一个离去的实体，兼之有恶意设备撤销的情况，因此若完全按照前人文章中的累加器的执行路径去执行的话，会有性能的问题。</w:t>
       </w:r>
     </w:p>
     <w:p>
@@ -44,15 +83,47 @@
       </w:pPr>
       <w:r>
         <w:rPr>
-          <w:rFonts w:hint="eastAsia"/>
-          <w:lang w:val="en-US" w:eastAsia="zh-CN"/>
-        </w:rPr>
-        <w:t>跨域认证追求的是尽可能快的具备相当隐私保护能力的可审计的一个域间认证方案。因此，我们首先就是要保证UAV为主要代表的各个实体的真是身份不要那么容易泄露出去（这里我们并不考虑敌手对合法控制方的社会工程学攻击，对于一个仅从技术层面考量的认证方案而言，预防什么社会工程学打击未免有些超纲了），就像上面论证的那样，一个累加器技术的确在全过程中计算复杂度极高，不可接受，但只要不让它执行完全过程，我们就会惊讶地发现，在添加实体并生成一个能代表曾加入过某个集合的实体数量这件任务上，累加器的表现相当好，这时的累加器只是一个模指数运算，复杂度高，但在密码学视角并没有什么不可接受的。</w:t>
-      </w:r>
-    </w:p>
-    <w:p>
+          <w:rFonts w:hint="default"/>
+          <w:lang w:val="en-US" w:eastAsia="zh-CN"/>
+        </w:rPr>
+        <w:t>基于“不让其执行完全过程”的剪枝思想，将累加器从撤销阶段解耦，前置迁移至无人机假名生成与系统注册阶段。利用其在“添加实体及生成数量代表”任务上的高效表现，将其作为无人机本地群身份标识与动态伪随机数的生成源。每一辆新UAV</w:t>
+      </w:r>
       <w:bookmarkStart w:id="0" w:name="_GoBack"/>
       <w:bookmarkEnd w:id="0"/>
+      <w:r>
+        <w:rPr>
+          <w:rFonts w:hint="default"/>
+          <w:lang w:val="en-US" w:eastAsia="zh-CN"/>
+        </w:rPr>
+        <w:t>加入时顺序迭代素数指标，即使后续设备离开或被撤销也无需重构安全参数或全网同步，以</w:t>
+      </w:r>
+      <m:oMath>
+        <m:r>
+          <m:rPr>
+            <m:scr m:val="script"/>
+          </m:rPr>
+          <w:rPr>
+            <w:rFonts w:hint="default" w:ascii="Cambria Math" w:hAnsi="Cambria Math" w:eastAsia="MS Mincho"/>
+            <w:sz w:val="21"/>
+          </w:rPr>
+          <m:t>O</m:t>
+        </m:r>
+        <m:r>
+          <m:rPr/>
+          <w:rPr>
+            <w:rFonts w:hint="default" w:ascii="Cambria Math" w:hAnsi="Cambria Math"/>
+            <w:sz w:val="21"/>
+          </w:rPr>
+          <m:t>(1)</m:t>
+        </m:r>
+      </m:oMath>
+      <w:r>
+        <w:rPr>
+          <w:rFonts w:hint="default"/>
+          <w:lang w:val="en-US" w:eastAsia="zh-CN"/>
+        </w:rPr>
+        <w:t>的低模乘法代价为签名注入了随机性与唯一性。</w:t>
+      </w:r>
     </w:p>
     <w:sectPr>
       <w:pgSz w:w="11906" w:h="16838"/>
@@ -69,7 +140,7 @@
   <w:docDefaults>
     <w:rPrDefault>
       <w:rPr>
-        <w:rFonts w:asciiTheme="minorHAnsi" w:hAnsiTheme="minorHAnsi" w:eastAsiaTheme="minorEastAsia" w:cstheme="minorBidi"/>
+        <w:rFonts w:ascii="Times New Roman" w:hAnsi="Times New Roman" w:eastAsia="宋体" w:cs="Times New Roman"/>
       </w:rPr>
     </w:rPrDefault>
     <w:pPrDefault/>

</xml_diff>

<commit_message>
Commit At 2026-08-28 00:32:17
</commit_message>
<xml_diff>
--- a/周报.docx
+++ b/周报.docx
@@ -4,27 +4,205 @@
   <w:body>
     <w:p>
       <w:pPr>
-        <w:ind w:firstLine="420" w:firstLineChars="0"/>
-        <w:rPr>
-          <w:rFonts w:hint="default"/>
-          <w:lang w:val="en-US" w:eastAsia="zh-CN"/>
-        </w:rPr>
-      </w:pPr>
+        <w:rPr>
+          <w:rFonts w:hint="default"/>
+          <w:lang w:val="en-US" w:eastAsia="zh-CN"/>
+        </w:rPr>
+      </w:pPr>
+      <w:r>
+        <w:rPr>
+          <w:rFonts w:hint="default"/>
+          <w:lang w:val="en-US" w:eastAsia="zh-CN"/>
+        </w:rPr>
+        <w:t>上周工作</w:t>
+      </w:r>
       <w:r>
         <w:rPr>
           <w:rFonts w:hint="eastAsia"/>
           <w:lang w:val="en-US" w:eastAsia="zh-CN"/>
         </w:rPr>
-        <w:t>这周主要工作是对方案进行了验证，确定了其可行性。在周四汇报的时候，章老师建议先将方案以论文的格式写出来，这是我这两天干的事情，不过目前还未完成，在找到的IEEE的Latex中直接输入中文的话，编译出来的效果有问题——只要有中文，编译便会失败，并且给出一个看起来跟输入位置无关的错误，因此现在是以论文的语言编排方案结构，并同时进行翻译。至于中文在Latex模板的兼容性问题，现在在找相应的解决方案，应该很快就能解决，鉴于论文最后</w:t>
+        <w:t>：</w:t>
+      </w:r>
+    </w:p>
+    <w:p>
+      <w:pPr>
+        <w:rPr>
+          <w:rFonts w:hint="default"/>
+          <w:lang w:val="en-US" w:eastAsia="zh-CN"/>
+        </w:rPr>
+      </w:pPr>
+      <w:r>
+        <w:rPr>
+          <w:rFonts w:hint="default"/>
+          <w:lang w:val="en-US" w:eastAsia="zh-CN"/>
+        </w:rPr>
+        <w:t>针对恶意请求过滤模块完成方案设计：采用多层轻量化过滤器对请求进行前置筛选，过滤后再送入撤销处理环节，以此削减合法性验证环节的交互通信开销。该模块依托布隆过滤器做兜底保障，实现恶意请求判定精确率</w:t>
       </w:r>
       <w:bookmarkStart w:id="0" w:name="_GoBack"/>
       <w:bookmarkEnd w:id="0"/>
       <w:r>
         <w:rPr>
+          <w:rFonts w:hint="default"/>
+          <w:lang w:val="en-US" w:eastAsia="zh-CN"/>
+        </w:rPr>
+        <w:t>100%，即被标记为恶意的请求必然属于恶意请求；多层过滤架构同时保障统计层面具备可观的恶意请求召回能力。</w:t>
+      </w:r>
+    </w:p>
+    <w:p>
+      <w:pPr>
+        <w:rPr>
+          <w:rFonts w:hint="default"/>
+          <w:lang w:val="en-US" w:eastAsia="zh-CN"/>
+        </w:rPr>
+      </w:pPr>
+    </w:p>
+    <w:p>
+      <w:pPr>
+        <w:rPr>
+          <w:rFonts w:hint="default"/>
+          <w:lang w:val="en-US" w:eastAsia="zh-CN"/>
+        </w:rPr>
+      </w:pPr>
+      <w:r>
+        <w:rPr>
+          <w:rFonts w:hint="default"/>
+          <w:lang w:val="en-US" w:eastAsia="zh-CN"/>
+        </w:rPr>
+        <w:t>本周工作</w:t>
+      </w:r>
+      <w:r>
+        <w:rPr>
           <w:rFonts w:hint="eastAsia"/>
           <w:lang w:val="en-US" w:eastAsia="zh-CN"/>
         </w:rPr>
-        <w:t>会翻译成英文，当下这并不是紧急事项。</w:t>
+        <w:t>：</w:t>
+      </w:r>
+    </w:p>
+    <w:p>
+      <w:pPr>
+        <w:rPr>
+          <w:rFonts w:hint="default"/>
+          <w:lang w:val="en-US" w:eastAsia="zh-CN"/>
+        </w:rPr>
+      </w:pPr>
+      <w:r>
+        <w:rPr>
+          <w:rFonts w:hint="default"/>
+          <w:lang w:val="en-US" w:eastAsia="zh-CN"/>
+        </w:rPr>
+        <w:t>1.过滤器架构迭代优化</w:t>
+      </w:r>
+    </w:p>
+    <w:p>
+      <w:pPr>
+        <w:rPr>
+          <w:rFonts w:hint="default"/>
+          <w:lang w:val="en-US" w:eastAsia="zh-CN"/>
+        </w:rPr>
+      </w:pPr>
+      <w:r>
+        <w:rPr>
+          <w:rFonts w:hint="default"/>
+          <w:lang w:val="en-US" w:eastAsia="zh-CN"/>
+        </w:rPr>
+        <w:t>细化各层过滤器的内部逻辑细节，对筛选逻辑存在大量无效结果重叠的过滤层级进行裁剪。在小幅损失理论召回能力、几乎不牺牲识别准确率的条件下，有效降低系统整体计算与通信期望开销，进一步适配资源受限场景下无人机跨域认证的性能需求。</w:t>
+      </w:r>
+    </w:p>
+    <w:p>
+      <w:pPr>
+        <w:rPr>
+          <w:rFonts w:hint="default"/>
+          <w:lang w:val="en-US" w:eastAsia="zh-CN"/>
+        </w:rPr>
+      </w:pPr>
+      <w:r>
+        <w:rPr>
+          <w:rFonts w:hint="default"/>
+          <w:lang w:val="en-US" w:eastAsia="zh-CN"/>
+        </w:rPr>
+        <w:t>2.无人机跨域认证相关文献调研与技术分析</w:t>
+      </w:r>
+    </w:p>
+    <w:p>
+      <w:pPr>
+        <w:rPr>
+          <w:rFonts w:hint="default"/>
+          <w:lang w:val="en-US" w:eastAsia="zh-CN"/>
+        </w:rPr>
+      </w:pPr>
+      <w:r>
+        <w:rPr>
+          <w:rFonts w:hint="default"/>
+          <w:lang w:val="en-US" w:eastAsia="zh-CN"/>
+        </w:rPr>
+        <w:t>研读章老师推荐的无人机网络轻量化去中心化硬件指纹认证文献</w:t>
+      </w:r>
+    </w:p>
+    <w:p>
+      <w:pPr>
+        <w:rPr>
+          <w:rFonts w:hint="default"/>
+          <w:lang w:val="en-US" w:eastAsia="zh-CN"/>
+        </w:rPr>
+      </w:pPr>
+      <w:r>
+        <w:rPr>
+          <w:rFonts w:hint="default"/>
+          <w:lang w:val="en-US" w:eastAsia="zh-CN"/>
+        </w:rPr>
+        <w:t>该方案融合 PUF 硬件根信任、区块链去中心化、门限秘密共享多项核心技术，针对无人机跨域场景下的典型安全痛点：跨域密钥泄露、域内认证单点故障、PUF 遭受机器学习攻击、CRP 质询响应对滥用、跨域身份追踪五大问题给出完整解决方案。</w:t>
+      </w:r>
+    </w:p>
+    <w:p>
+      <w:pPr>
+        <w:rPr>
+          <w:rFonts w:hint="default"/>
+          <w:lang w:val="en-US" w:eastAsia="zh-CN"/>
+        </w:rPr>
+      </w:pPr>
+      <w:r>
+        <w:rPr>
+          <w:rFonts w:hint="default"/>
+          <w:lang w:val="en-US" w:eastAsia="zh-CN"/>
+        </w:rPr>
+        <w:t>在无人机跨域多节点安全全覆盖的基础上，该方案具备低计算量、低通信交互、低链上存储开销的优势，十分契合算力、带宽受限的无人机集群跨域交互场景。</w:t>
+      </w:r>
+    </w:p>
+    <w:p>
+      <w:pPr>
+        <w:rPr>
+          <w:rFonts w:hint="default"/>
+          <w:lang w:val="en-US" w:eastAsia="zh-CN"/>
+        </w:rPr>
+      </w:pPr>
+    </w:p>
+    <w:p>
+      <w:pPr>
+        <w:rPr>
+          <w:rFonts w:hint="default"/>
+          <w:lang w:val="en-US" w:eastAsia="zh-CN"/>
+        </w:rPr>
+      </w:pPr>
+      <w:r>
+        <w:rPr>
+          <w:rFonts w:hint="default"/>
+          <w:lang w:val="en-US" w:eastAsia="zh-CN"/>
+        </w:rPr>
+        <w:t>思考</w:t>
+      </w:r>
+      <w:r>
+        <w:rPr>
+          <w:rFonts w:hint="eastAsia"/>
+          <w:lang w:val="en-US" w:eastAsia="zh-CN"/>
+        </w:rPr>
+        <w:t>：</w:t>
+      </w:r>
+      <w:r>
+        <w:rPr>
+          <w:rFonts w:hint="default"/>
+          <w:lang w:val="en-US" w:eastAsia="zh-CN"/>
+        </w:rPr>
+        <w:t>现有项目的恶意请求过滤、高效撤销模块，可与该文献的去中心化硬件指纹认证思路做结合。无人机在跨不同管控域执行身份认证时，跨域交互会带来大量外部接入请求，会放大通信开销、恶意伪造请求、身份篡改等风险。后续可考虑把多层轻量化过滤机制，应用于无人机跨域接入的请求前置拦截：在跨域正式认证执行之前，先通过轻量化过滤器筛除大部分非法、伪造的跨域接入请求，减少跨域区块链交互、PUF 质询验证的调用频次；依靠布隆过滤器兜底保证恶意请求判定精确率，兼顾跨域场景的安全强度与资源开销，实现 “恶意请求过滤‑硬件指纹认证‑跨域身份撤销” 的完整链路。</w:t>
       </w:r>
     </w:p>
     <w:sectPr>
@@ -151,7 +329,7 @@
     <w:lsdException w:unhideWhenUsed="0" w:uiPriority="0" w:semiHidden="0" w:name="HTML Sample"/>
     <w:lsdException w:unhideWhenUsed="0" w:uiPriority="0" w:semiHidden="0" w:name="HTML Typewriter"/>
     <w:lsdException w:unhideWhenUsed="0" w:uiPriority="0" w:semiHidden="0" w:name="HTML Variable"/>
-    <w:lsdException w:unhideWhenUsed="0" w:uiPriority="0" w:name="Normal Table"/>
+    <w:lsdException w:qFormat="1" w:unhideWhenUsed="0" w:uiPriority="0" w:name="Normal Table"/>
     <w:lsdException w:unhideWhenUsed="0" w:uiPriority="0" w:semiHidden="0" w:name="annotation subject"/>
     <w:lsdException w:unhideWhenUsed="0" w:uiPriority="0" w:semiHidden="0" w:name="Table Simple 1"/>
     <w:lsdException w:unhideWhenUsed="0" w:uiPriority="0" w:semiHidden="0" w:name="Table Simple 2"/>
@@ -313,14 +491,59 @@
       <w:lang w:val="en-US" w:eastAsia="zh-CN" w:bidi="ar-SA"/>
     </w:rPr>
   </w:style>
-  <w:style w:type="character" w:default="1" w:styleId="3">
+  <w:style w:type="paragraph" w:styleId="2">
+    <w:name w:val="heading 2"/>
+    <w:basedOn w:val="1"/>
+    <w:next w:val="1"/>
+    <w:semiHidden/>
+    <w:unhideWhenUsed/>
+    <w:qFormat/>
+    <w:uiPriority w:val="0"/>
+    <w:pPr>
+      <w:spacing w:before="0" w:beforeAutospacing="1" w:after="0" w:afterAutospacing="1"/>
+      <w:jc w:val="left"/>
+    </w:pPr>
+    <w:rPr>
+      <w:rFonts w:hint="eastAsia" w:ascii="宋体" w:hAnsi="宋体" w:eastAsia="宋体" w:cs="宋体"/>
+      <w:b/>
+      <w:bCs/>
+      <w:kern w:val="0"/>
+      <w:sz w:val="36"/>
+      <w:szCs w:val="36"/>
+      <w:lang w:val="en-US" w:eastAsia="zh-CN" w:bidi="ar"/>
+    </w:rPr>
+  </w:style>
+  <w:style w:type="paragraph" w:styleId="3">
+    <w:name w:val="heading 3"/>
+    <w:basedOn w:val="1"/>
+    <w:next w:val="1"/>
+    <w:semiHidden/>
+    <w:unhideWhenUsed/>
+    <w:qFormat/>
+    <w:uiPriority w:val="0"/>
+    <w:pPr>
+      <w:spacing w:before="0" w:beforeAutospacing="1" w:after="0" w:afterAutospacing="1"/>
+      <w:jc w:val="left"/>
+    </w:pPr>
+    <w:rPr>
+      <w:rFonts w:hint="eastAsia" w:ascii="宋体" w:hAnsi="宋体" w:eastAsia="宋体" w:cs="宋体"/>
+      <w:b/>
+      <w:bCs/>
+      <w:kern w:val="0"/>
+      <w:sz w:val="27"/>
+      <w:szCs w:val="27"/>
+      <w:lang w:val="en-US" w:eastAsia="zh-CN" w:bidi="ar"/>
+    </w:rPr>
+  </w:style>
+  <w:style w:type="character" w:default="1" w:styleId="6">
     <w:name w:val="Default Paragraph Font"/>
     <w:semiHidden/>
     <w:uiPriority w:val="0"/>
   </w:style>
-  <w:style w:type="table" w:default="1" w:styleId="2">
+  <w:style w:type="table" w:default="1" w:styleId="5">
     <w:name w:val="Normal Table"/>
     <w:semiHidden/>
+    <w:qFormat/>
     <w:uiPriority w:val="0"/>
     <w:tblPr>
       <w:tblCellMar>
@@ -330,6 +553,30 @@
         <w:right w:w="108" w:type="dxa"/>
       </w:tblCellMar>
     </w:tblPr>
+  </w:style>
+  <w:style w:type="paragraph" w:styleId="4">
+    <w:name w:val="Normal (Web)"/>
+    <w:basedOn w:val="1"/>
+    <w:uiPriority w:val="0"/>
+    <w:pPr>
+      <w:spacing w:before="0" w:beforeAutospacing="1" w:after="0" w:afterAutospacing="1"/>
+      <w:ind w:left="0" w:right="0"/>
+      <w:jc w:val="left"/>
+    </w:pPr>
+    <w:rPr>
+      <w:kern w:val="0"/>
+      <w:sz w:val="24"/>
+      <w:lang w:val="en-US" w:eastAsia="zh-CN" w:bidi="ar"/>
+    </w:rPr>
+  </w:style>
+  <w:style w:type="character" w:styleId="7">
+    <w:name w:val="Strong"/>
+    <w:basedOn w:val="6"/>
+    <w:qFormat/>
+    <w:uiPriority w:val="0"/>
+    <w:rPr>
+      <w:b/>
+    </w:rPr>
   </w:style>
 </w:styles>
 </file>

</xml_diff>